<commit_message>
release: finalize editable Figure 1, phase3 figures, supplementary 1-14 and submission pack
Co-Authored-By: EvoX <evox@evomap.ai>
</commit_message>
<xml_diff>
--- a/data_audit/outputs/submission_pack/manuscript_full_en_v1.docx
+++ b/data_audit/outputs/submission_pack/manuscript_full_en_v1.docx
@@ -668,7 +668,16 @@
         <w:t>1.2 Included datasets and samples.</w:t>
       </w:r>
       <w:r>
-        <w:t xml:space="preserve"> Nine transcriptomic analysis units, 337 samples (8 GEO accessions; GSE312393 split into acute 24h and 6-week training units). Coverage of the 59-gene axis was 100% in most datasets (GSE305038 84.7%, GSE282850 79.7%; missing genes scored from available genes).</w:t>
+        <w:t xml:space="preserve"> Nine transcriptomic analysis units, </w:t>
+      </w:r>
+      <w:r>
+        <w:rPr>
+          <w:b/>
+        </w:rPr>
+        <w:t>337 unique formal analysis samples</w:t>
+      </w:r>
+      <w:r>
+        <w:t xml:space="preserve"> (8 GEO accessions; GSE312393 split into acute 24h and 6-week training units). Coverage of the 59-gene axis was 100% in most datasets (GSE305038 84.7%, GSE282850 79.7%; missing genes scored from available genes). The sample-level score table contains 346 analysis-unit records because the 13 GSE312393 samples are represented in both split units; the long-format GEO metadata contains 351 provenance rows. These record counts are not additional biological samples.</w:t>
       </w:r>
     </w:p>
     <w:p>
@@ -696,7 +705,7 @@
     </w:p>
     <w:p>
       <w:r>
-        <w:t>Sample-level file contains 346 rows across 9 analysis units; after deduplication GSE312393 contributes 13 unique samples to two units (7 acute + 6 training), giving 337 unique samples (units do not double-count GSE312393 samples). Sample-level scores are provided in Supplementary Data 1.</w:t>
+        <w:t>The sample-level score file contains 346 analysis-unit records across 9 units. After deduplication, GSE312393 contributes 13 unique biological samples to two units (7 acute + 6 training), giving 337 unique formal analysis samples. The separate long-format GEO metadata file contains 351 provenance rows. Sample-level scores are provided in Supplementary Data 1.</w:t>
       </w:r>
     </w:p>
     <w:p>
@@ -798,7 +807,7 @@
         <w:t>3.1 Contrasts.</w:t>
       </w:r>
       <w:r>
-        <w:t xml:space="preserve"> 19 predefined contrasts (Supplementary Data 3), within-study controls preferred:</w:t>
+        <w:t xml:space="preserve"> 19 predefined contrasts (Supplementary Data 3), within-study controls preferred. Twelve paired exercise contrasts nested in four datasets enter the paired exercise meta-analysis; Figure 3 additionally displays one unpaired acute-24 h comparison for descriptive dynamics, so its plotted exercise display contains 13 contrasts:</w:t>
       </w:r>
     </w:p>
     <w:p>
@@ -1113,7 +1122,7 @@
     </w:p>
     <w:p>
       <w:r>
-        <w:t>All public datasets analysed in this study are available from the Gene Expression Omnibus (GEO) under the following accessions: GSE312393, GSE305038, GSE292369, GSE318937, GSE32575, GSE272133, GSE294150 and GSE282850 (Supplementary Data 1). Derived score tables, module-level statistics and Evo2 candidate/scoring outputs that support the findings of this study are provided as Supplementary Data 1–8 and archived at Zenodo (https://doi.org/10.5281/zenodo.22865789).</w:t>
+        <w:t>All public datasets analysed in this study are available from the Gene Expression Omnibus (GEO) under the following accessions: GSE312393, GSE305038, GSE292369, GSE318937, GSE32575, GSE272133, GSE294150 and GSE282850 (Supplementary Data 1). Derived score tables, module-level statistics and Evo2 candidate/scoring outputs that support the findings of this study are provided as Supplementary Data 1–14 and archived at Zenodo (https://doi.org/10.5281/zenodo.22865789).</w:t>
       </w:r>
     </w:p>
     <w:p>
@@ -1369,7 +1378,7 @@
         <w:t>a</w:t>
       </w:r>
       <w:r>
-        <w:t xml:space="preserve">, NAMPT_z, inflammatory, repair and balance scores across exercise cohorts (12 paired contrasts, 4 datasets). </w:t>
+        <w:t xml:space="preserve">, NAMPT_z, inflammatory, repair and balance scores across exercise cohorts (13 contrasts plotted: 12 paired contrasts plus one unpaired acute-24 h comparison; 4 datasets). The unpaired display contrast is descriptive and is not included in the paired meta-analysis. </w:t>
       </w:r>
       <w:r>
         <w:rPr>
@@ -1395,7 +1404,7 @@
         <w:pStyle w:val="Heading3"/>
       </w:pPr>
       <w:r>
-        <w:t>Figure 4 | Random-effects meta-analysis of the exercise NAMPT axis.</w:t>
+        <w:t>Figure 4 | Cross-dataset validation of the NAMPT axis.</w:t>
       </w:r>
     </w:p>
     <w:p>
@@ -1406,7 +1415,7 @@
         <w:t>a</w:t>
       </w:r>
       <w:r>
-        <w:t xml:space="preserve">, Pooled effects by stratum and metric (contrast-level DerSimonian–Laird: NAMPT_z +0.85, 95% CI 0.53–1.17, p = 1.8e-7; balance −0.62, p = 0.016; inflammatory +0.28, ns; repair −0.33, p = 0.05) with I² and τ². </w:t>
+        <w:t xml:space="preserve">, Contrast-level random-effects estimates across exercise, obesity and cell-model strata; cell-model results are directional evidence from one dataset. </w:t>
       </w:r>
       <w:r>
         <w:rPr>
@@ -1415,7 +1424,16 @@
         <w:t>b</w:t>
       </w:r>
       <w:r>
-        <w:t>, Per-contrast forest plot for exercise/NAMPT_z (12 contrasts); cluster-aware dataset-level estimate (k = 4, +0.965) and leave-one-dataset-out sensitivity are shown.</w:t>
+        <w:t xml:space="preserve">, Dataset-level cluster-aware estimates for exercise and obesity, with the number of independent datasets shown as k. </w:t>
+      </w:r>
+      <w:r>
+        <w:rPr>
+          <w:b/>
+        </w:rPr>
+        <w:t>c</w:t>
+      </w:r>
+      <w:r>
+        <w:t>, Exercise leave-one-dataset-out robustness across the four NAMPT-axis metrics. Contrast-level exercise meta-analysis uses 12 paired contrasts; Figure 3 displays 13 contrasts for descriptive dynamics.</w:t>
       </w:r>
     </w:p>
     <w:p>
@@ -1423,7 +1441,7 @@
         <w:pStyle w:val="Heading3"/>
       </w:pPr>
       <w:r>
-        <w:t>Figure 5 | Obesity and weight loss: tissue- and disease-background dependence of the NAMPT axis.</w:t>
+        <w:t>Figure 5 | Obesity and weight-loss tissue and disease-background dependence.</w:t>
       </w:r>
     </w:p>
     <w:p>
@@ -1434,7 +1452,7 @@
         <w:t>a</w:t>
       </w:r>
       <w:r>
-        <w:t xml:space="preserve">, Obesity-layer meta (k = 3, directional): NAMPT_z +0.14; inflammatory +0.57. </w:t>
+        <w:t xml:space="preserve">, Four obesity/weight-loss contrasts across monocyte and skeletal-muscle units, shown with metric-specific estimates and confidence intervals. </w:t>
       </w:r>
       <w:r>
         <w:rPr>
@@ -1443,7 +1461,7 @@
         <w:t>b</w:t>
       </w:r>
       <w:r>
-        <w:t xml:space="preserve">, Post-bariatric monocyte remodeling (GSE32575): inflammatory and repair scores rise together post-surgery. </w:t>
+        <w:t xml:space="preserve">, Post-bariatric monocyte remodeling (GSE32575). </w:t>
       </w:r>
       <w:r>
         <w:rPr>
@@ -1452,7 +1470,7 @@
         <w:t>c</w:t>
       </w:r>
       <w:r>
-        <w:t>, Skeletal-muscle response by metabolic-disease status (GSE272133): T2D post-surgery repair score +0.30.</w:t>
+        <w:t>, Skeletal-muscle responses in obese and T2D states (GSE272133). Cell-model AICAR/palmitate contrasts are reported separately as supplementary evidence.</w:t>
       </w:r>
     </w:p>
     <w:p>
@@ -1460,7 +1478,7 @@
         <w:pStyle w:val="Heading3"/>
       </w:pPr>
       <w:r>
-        <w:t>Figure 6 | Evo2-40B regulatory-variant prioritization.</w:t>
+        <w:t>Figure 6 | Exploratory Evo2-40B regulatory-variant extension.</w:t>
       </w:r>
     </w:p>
     <w:p>
@@ -1471,7 +1489,7 @@
         <w:t>a</w:t>
       </w:r>
       <w:r>
-        <w:t xml:space="preserve">, Prioritization workflow: Ensembl REST candidate build (12,961 → 432 functional variants within TSS ±2 kb of NAMPT/CD38/BST1/SIRT1/SIRT3/SIRT6/IL6/TNF), GRCh38 (hg38) ref/alt 2 kb windows, Evo2-40B scoring (Score A allele surprisal; Score B pseudo-likelihood), GTEx/GWAS Catalog merge and Tier assignment. </w:t>
+        <w:t xml:space="preserve">, Exploratory computational workflow from candidate construction through Evo2 scoring and external evidence integration. </w:t>
       </w:r>
       <w:r>
         <w:rPr>
@@ -1480,7 +1498,16 @@
         <w:t>b</w:t>
       </w:r>
       <w:r>
-        <w:t>, Candidate-set composition (n = 432 by gene window; NAMPT 12, CD38/BST1/SIRT1/SIRT3/SIRT6/IL6/TNF 60 each). Tier distribution (A = 0, B = 0, C = 97, External-only = 9, Excluded = 326) shown; Evo2 module is reported as supplementary (not a main figure).</w:t>
+        <w:t xml:space="preserve">, Candidate-set composition across 432 priority variants. </w:t>
+      </w:r>
+      <w:r>
+        <w:rPr>
+          <w:b/>
+        </w:rPr>
+        <w:t>c</w:t>
+      </w:r>
+      <w:r>
+        <w:t>, Tier distribution (A = 0, B = 0, C = 97, External-only = 9, Excluded = 326), reported as exploratory evidence rather than a validated mechanism or causal ranking.</w:t>
       </w:r>
     </w:p>
     <w:p>

</xml_diff>